<commit_message>
Fix EKAT table rendering and finalize editor QA
</commit_message>
<xml_diff>
--- a/public/templates/EKAT_Yetki_Belgesi_Takip_Cizelgesi_Sablonu.docx
+++ b/public/templates/EKAT_Yetki_Belgesi_Takip_Cizelgesi_Sablonu.docx
@@ -1225,7 +1225,7 @@
           <w:szCs w:val="22"/>
           <w:rtl w:val="0"/>
         </w:rPr>
-        <w:t xml:space="preserve">{#personeller} {/personeller}</w:t>
+        <w:t xml:space="preserve"/>
       </w:r>
     </w:p>
     <w:tbl>
@@ -1809,7 +1809,7 @@
                 <w:szCs w:val="18"/>
                 <w:rtl w:val="0"/>
               </w:rPr>
-              <w:t xml:space="preserve">{siraNo}</w:t>
+              <w:t xml:space="preserve">{#personeller}{siraNo}</w:t>
             </w:r>
           </w:p>
         </w:tc>
@@ -2193,7 +2193,7 @@
                 <w:szCs w:val="18"/>
                 <w:rtl w:val="0"/>
               </w:rPr>
-              <w:t xml:space="preserve">{durum}</w:t>
+              <w:t xml:space="preserve">{durum}{/personeller}</w:t>
             </w:r>
           </w:p>
         </w:tc>

</xml_diff>